<commit_message>
Correct the author bio to the real diagnosis and add the parent perspective
The bio and the covering email both described a late-diagnosed ADHD and
autistic writer. Johan confirmed he holds both diagnoses, so the article's
first-person ADHD line stands, but the autism diagnosis was originally
Asperger's and the bio never said so.

Now reads as autistic with ADHD, originally diagnosed with Asperger's, which
names the real diagnosis while using the terminology a US publisher expects
after DSM-5 folded Asperger's into autism spectrum disorder.

Also adds that he raised a child with autism and ADHD as a single father.
LDRFA's stated audience includes parents of children with learning
disabilities, and that perspective is close to absent in this space. Bio
only, by his choice; his child's situation stays out of the article body.

Regenerated the HTML, Word and PDF copies. The docx passes validation and
still carries all six links.

Co-Authored-By: Claude Opus 5 <noreply@anthropic.com>
</commit_message>
<xml_diff>
--- a/docs/submissions/2026-10-24-ldrfa-admin-costs.docx
+++ b/docs/submissions/2026-10-24-ldrfa-admin-costs.docx
@@ -174,7 +174,7 @@
       <w:r>
         <w:t xml:space="preserve">Speak Screen on an iPhone or iPad will read whatever is on screen. Microsoft Edge has Read Aloud built in, and </w:t>
       </w:r>
-      <w:hyperlink w:history="1" r:id="rId1ouruiovwyerx5ln6xqfb">
+      <w:hyperlink w:history="1" r:id="rIdvktxwd5kqfirozbzuevz3">
         <w:r>
           <w:rPr>
             <w:rStyle w:val="Hyperlink"/>
@@ -185,7 +185,7 @@
       <w:r>
         <w:t xml:space="preserve"> will read a document while highlighting the line, which helps if your eyes slide off text. LDRFA has a fuller round-up of </w:t>
       </w:r>
-      <w:hyperlink w:history="1" r:id="rId3lapjvhxcnlne3l2qgavt">
+      <w:hyperlink w:history="1" r:id="rIdmrlir7fnrbxmlxnld9pnq">
         <w:r>
           <w:rPr>
             <w:rStyle w:val="Hyperlink"/>
@@ -228,7 +228,7 @@
       <w:r>
         <w:t xml:space="preserve">Live Text on an iPhone lets you point the camera at a letter, select the text straight off the page, and copy it or have it read out. Google Lens does the same on Android. Apple lists the current features on its </w:t>
       </w:r>
-      <w:hyperlink w:history="1" r:id="rIdlt4tbj69qd1xttmztou5c">
+      <w:hyperlink w:history="1" r:id="rIdmmm7you2htfshjsrmrggd">
         <w:r>
           <w:rPr>
             <w:rStyle w:val="Hyperlink"/>
@@ -255,7 +255,7 @@
       <w:r>
         <w:t xml:space="preserve">If writing is the harder direction for you, </w:t>
       </w:r>
-      <w:hyperlink w:history="1" r:id="rIdcdp1krhginzo9fpklgncf">
+      <w:hyperlink w:history="1" r:id="rIdvhhez62udv1cazgbsdbcr">
         <w:r>
           <w:rPr>
             <w:rStyle w:val="Hyperlink"/>
@@ -298,7 +298,7 @@
       <w:r>
         <w:t xml:space="preserve">Voice assistants earn their place here, not for anything clever, but because the cost of capture is almost nothing. Saying a reminder out loud the second you think of it beats any system that requires you to open an app first. LDRFA has a </w:t>
       </w:r>
-      <w:hyperlink w:history="1" r:id="rIdmga153uhwkxlgrjxglfoo">
+      <w:hyperlink w:history="1" r:id="rId_ifyh4gdi1xe5fq5k2-zs">
         <w:r>
           <w:rPr>
             <w:rStyle w:val="Hyperlink"/>
@@ -434,9 +434,9 @@
         <w:spacing w:after="180"/>
       </w:pPr>
       <w:r>
-        <w:t xml:space="preserve">J.M. Struijk is a late-diagnosed ADHD and autistic writer, and the author of practical, non-clinical books for adults working out what a late diagnosis means day to day. Free tools, including an ADHD Tax Calculator and a Subscription Audit, are at </w:t>
-      </w:r>
-      <w:hyperlink w:history="1" r:id="rIda4aqzw6ggd9lwdcr81p9q">
+        <w:t xml:space="preserve">J.M. Struijk is an autistic writer with ADHD, originally diagnosed with Asperger's, and a single father who raised a child with autism and ADHD. His books are practical and non-clinical, written for adults working out what a late diagnosis means day to day. Free tools, including an ADHD Tax Calculator and a Subscription Audit, are at </w:t>
+      </w:r>
+      <w:hyperlink w:history="1" r:id="rIdzktr1lpheikstoqig6kzy">
         <w:r>
           <w:rPr>
             <w:rStyle w:val="Hyperlink"/>

</xml_diff>